<commit_message>
dodalem wybor miejsca statkow
</commit_message>
<xml_diff>
--- a/dokumentacja.docx
+++ b/dokumentacja.docx
@@ -5,6 +5,17 @@
     <w:p>
       <w:r>
         <w:t>Start dnia 28.05.26</w:t>
+      </w:r>
+    </w:p>
+    <w:p>
+      <w:r>
+        <w:t>CEL: GRA W STATKI</w:t>
+      </w:r>
+    </w:p>
+    <w:p/>
+    <w:p>
+      <w:r>
+        <w:t>29.05 wybieranie miejsc statków przez gracza</w:t>
       </w:r>
     </w:p>
     <w:sectPr>
@@ -176,6 +187,7 @@
   <w:style w:type="paragraph" w:default="1" w:styleId="Normalny">
     <w:name w:val="Normal"/>
     <w:qFormat/>
+    <w:rsid w:val="00591E5D"/>
   </w:style>
   <w:style w:type="character" w:default="1" w:styleId="Domylnaczcionkaakapitu">
     <w:name w:val="Default Paragraph Font"/>

</xml_diff>